<commit_message>
第一个copote OA release版本 userid改为了long,数据库bigint
</commit_message>
<xml_diff>
--- a/src/template/工资清单.docx
+++ b/src/template/工资清单.docx
@@ -165,7 +165,7 @@
         <w:fldChar w:fldCharType="begin"/>
       </w:r>
       <w:r>
-        <w:instrText xml:space="preserve"> HYPERLINK "mailto:pengyanhui@copote.com" </w:instrText>
+        <w:instrText>HYPERLINK "mailto:liuzhaohui@copote.com"</w:instrText>
       </w:r>
       <w:r>
         <w:fldChar w:fldCharType="separate"/>
@@ -173,12 +173,12 @@
       <w:r>
         <w:rPr>
           <w:rStyle w:val="ad"/>
-          <w:rFonts w:ascii="微软雅黑" w:eastAsia="微软雅黑" w:hAnsi="微软雅黑" w:cs="Arial" w:hint="eastAsia"/>
+          <w:rFonts w:ascii="微软雅黑" w:eastAsia="微软雅黑" w:hAnsi="微软雅黑" w:cs="Arial"/>
           <w:b/>
           <w:sz w:val="18"/>
           <w:szCs w:val="18"/>
         </w:rPr>
-        <w:t>liuqiong</w:t>
+        <w:t>${</w:t>
       </w:r>
       <w:r>
         <w:rPr>
@@ -188,7 +188,7 @@
           <w:sz w:val="18"/>
           <w:szCs w:val="18"/>
         </w:rPr>
-        <w:t>@copote.com</w:t>
+        <w:t>cEmail}</w:t>
       </w:r>
       <w:r>
         <w:rPr>
@@ -208,17 +208,6 @@
           <w:szCs w:val="18"/>
         </w:rPr>
         <w:t>或联系</w:t>
-      </w:r>
-      <w:r>
-        <w:rPr>
-          <w:rFonts w:ascii="微软雅黑" w:eastAsia="微软雅黑" w:hAnsi="微软雅黑" w:cs="Arial"/>
-          <w:b/>
-          <w:color w:val="0000FF"/>
-          <w:sz w:val="18"/>
-          <w:szCs w:val="18"/>
-          <w:u w:val="single"/>
-        </w:rPr>
-        <w:t>0731-8899</w:t>
       </w:r>
       <w:r>
         <w:rPr>
@@ -229,7 +218,42 @@
           <w:szCs w:val="18"/>
           <w:u w:val="single"/>
         </w:rPr>
-        <w:t>8775</w:t>
+        <w:t>$</w:t>
+      </w:r>
+      <w:r>
+        <w:rPr>
+          <w:rFonts w:ascii="微软雅黑" w:eastAsia="微软雅黑" w:hAnsi="微软雅黑" w:cs="Arial"/>
+          <w:b/>
+          <w:color w:val="0000FF"/>
+          <w:sz w:val="18"/>
+          <w:szCs w:val="18"/>
+          <w:u w:val="single"/>
+        </w:rPr>
+        <w:t>{</w:t>
+      </w:r>
+      <w:proofErr w:type="spellStart"/>
+      <w:r>
+        <w:rPr>
+          <w:rFonts w:ascii="微软雅黑" w:eastAsia="微软雅黑" w:hAnsi="微软雅黑" w:cs="Arial"/>
+          <w:b/>
+          <w:color w:val="0000FF"/>
+          <w:sz w:val="18"/>
+          <w:szCs w:val="18"/>
+          <w:u w:val="single"/>
+        </w:rPr>
+        <w:t>cMobileNo</w:t>
+      </w:r>
+      <w:proofErr w:type="spellEnd"/>
+      <w:r>
+        <w:rPr>
+          <w:rFonts w:ascii="微软雅黑" w:eastAsia="微软雅黑" w:hAnsi="微软雅黑" w:cs="Arial"/>
+          <w:b/>
+          <w:color w:val="0000FF"/>
+          <w:sz w:val="18"/>
+          <w:szCs w:val="18"/>
+          <w:u w:val="single"/>
+        </w:rPr>
+        <w:t>}</w:t>
       </w:r>
       <w:r>
         <w:rPr>
@@ -1231,6 +1255,7 @@
                 <w:szCs w:val="18"/>
               </w:rPr>
             </w:pPr>
+            <w:bookmarkStart w:id="0" w:name="_GoBack" w:colFirst="2" w:colLast="2"/>
             <w:r>
               <w:rPr>
                 <w:rFonts w:ascii="微软雅黑" w:eastAsia="微软雅黑" w:hAnsi="微软雅黑" w:cs="Arial"/>
@@ -1298,7 +1323,7 @@
                 <w:sz w:val="18"/>
                 <w:szCs w:val="18"/>
               </w:rPr>
-              <w:t>医疗个人扣款</w:t>
+              <w:t>公积金个人扣款</w:t>
             </w:r>
           </w:p>
         </w:tc>
@@ -1352,7 +1377,198 @@
                 <w:sz w:val="18"/>
                 <w:szCs w:val="18"/>
               </w:rPr>
-              <w:t>nMedical</w:t>
+              <w:t>nGjjgrkk</w:t>
+            </w:r>
+            <w:proofErr w:type="spellEnd"/>
+            <w:r>
+              <w:rPr>
+                <w:rFonts w:ascii="微软雅黑" w:eastAsia="微软雅黑" w:hAnsi="微软雅黑" w:cs="Arial"/>
+                <w:bCs/>
+                <w:color w:val="000000"/>
+                <w:kern w:val="0"/>
+                <w:sz w:val="18"/>
+                <w:szCs w:val="18"/>
+              </w:rPr>
+              <w:t>}</w:t>
+            </w:r>
+          </w:p>
+        </w:tc>
+      </w:tr>
+      <w:bookmarkEnd w:id="0"/>
+      <w:tr>
+        <w:trPr>
+          <w:trHeight w:val="312"/>
+        </w:trPr>
+        <w:tc>
+          <w:tcPr>
+            <w:tcW w:w="2577" w:type="dxa"/>
+            <w:vAlign w:val="center"/>
+          </w:tcPr>
+          <w:p>
+            <w:pPr>
+              <w:widowControl/>
+              <w:jc w:val="left"/>
+              <w:rPr>
+                <w:rFonts w:ascii="微软雅黑" w:eastAsia="微软雅黑" w:hAnsi="微软雅黑" w:cs="Arial"/>
+                <w:color w:val="000000"/>
+                <w:kern w:val="0"/>
+                <w:sz w:val="18"/>
+                <w:szCs w:val="18"/>
+              </w:rPr>
+            </w:pPr>
+            <w:r>
+              <w:rPr>
+                <w:rFonts w:ascii="微软雅黑" w:eastAsia="微软雅黑" w:hAnsi="微软雅黑" w:cs="Arial" w:hint="eastAsia"/>
+                <w:color w:val="000000"/>
+                <w:kern w:val="0"/>
+                <w:sz w:val="18"/>
+                <w:szCs w:val="18"/>
+              </w:rPr>
+              <w:t>绩效实发工资</w:t>
+            </w:r>
+          </w:p>
+        </w:tc>
+        <w:tc>
+          <w:tcPr>
+            <w:tcW w:w="2460" w:type="dxa"/>
+            <w:vAlign w:val="center"/>
+          </w:tcPr>
+          <w:p>
+            <w:pPr>
+              <w:widowControl/>
+              <w:jc w:val="center"/>
+              <w:rPr>
+                <w:rFonts w:ascii="微软雅黑" w:eastAsia="微软雅黑" w:hAnsi="微软雅黑" w:cs="Arial"/>
+                <w:color w:val="000000"/>
+                <w:kern w:val="0"/>
+                <w:sz w:val="18"/>
+                <w:szCs w:val="18"/>
+              </w:rPr>
+            </w:pPr>
+            <w:r>
+              <w:rPr>
+                <w:rFonts w:ascii="微软雅黑" w:eastAsia="微软雅黑" w:hAnsi="微软雅黑" w:cs="Arial" w:hint="eastAsia"/>
+                <w:color w:val="000000"/>
+                <w:kern w:val="0"/>
+                <w:sz w:val="18"/>
+                <w:szCs w:val="18"/>
+              </w:rPr>
+              <w:t>$</w:t>
+            </w:r>
+            <w:r>
+              <w:rPr>
+                <w:rFonts w:ascii="微软雅黑" w:eastAsia="微软雅黑" w:hAnsi="微软雅黑" w:cs="Arial"/>
+                <w:color w:val="000000"/>
+                <w:kern w:val="0"/>
+                <w:sz w:val="18"/>
+                <w:szCs w:val="18"/>
+              </w:rPr>
+              <w:t>{</w:t>
+            </w:r>
+            <w:proofErr w:type="spellStart"/>
+            <w:r>
+              <w:rPr>
+                <w:rFonts w:ascii="微软雅黑" w:eastAsia="微软雅黑" w:hAnsi="微软雅黑" w:cs="Arial"/>
+                <w:color w:val="000000"/>
+                <w:kern w:val="0"/>
+                <w:sz w:val="18"/>
+                <w:szCs w:val="18"/>
+              </w:rPr>
+              <w:t>nJiXiao</w:t>
+            </w:r>
+            <w:proofErr w:type="spellEnd"/>
+            <w:r>
+              <w:rPr>
+                <w:rFonts w:ascii="微软雅黑" w:eastAsia="微软雅黑" w:hAnsi="微软雅黑" w:cs="Arial"/>
+                <w:color w:val="000000"/>
+                <w:kern w:val="0"/>
+                <w:sz w:val="18"/>
+                <w:szCs w:val="18"/>
+              </w:rPr>
+              <w:t>}</w:t>
+            </w:r>
+          </w:p>
+        </w:tc>
+        <w:tc>
+          <w:tcPr>
+            <w:tcW w:w="2460" w:type="dxa"/>
+            <w:vAlign w:val="center"/>
+          </w:tcPr>
+          <w:p>
+            <w:pPr>
+              <w:widowControl/>
+              <w:jc w:val="left"/>
+              <w:rPr>
+                <w:rFonts w:ascii="微软雅黑" w:eastAsia="微软雅黑" w:hAnsi="微软雅黑" w:cs="Arial"/>
+                <w:color w:val="000000"/>
+                <w:kern w:val="0"/>
+                <w:sz w:val="18"/>
+                <w:szCs w:val="18"/>
+              </w:rPr>
+            </w:pPr>
+            <w:r>
+              <w:rPr>
+                <w:rFonts w:ascii="微软雅黑" w:eastAsia="微软雅黑" w:hAnsi="微软雅黑" w:cs="Arial" w:hint="eastAsia"/>
+                <w:color w:val="000000"/>
+                <w:kern w:val="0"/>
+                <w:sz w:val="18"/>
+                <w:szCs w:val="18"/>
+              </w:rPr>
+              <w:t>企业年金个人扣款</w:t>
+            </w:r>
+          </w:p>
+        </w:tc>
+        <w:tc>
+          <w:tcPr>
+            <w:tcW w:w="2569" w:type="dxa"/>
+            <w:vAlign w:val="center"/>
+          </w:tcPr>
+          <w:p>
+            <w:pPr>
+              <w:widowControl/>
+              <w:jc w:val="center"/>
+              <w:rPr>
+                <w:rFonts w:ascii="微软雅黑" w:eastAsia="微软雅黑" w:hAnsi="微软雅黑" w:cs="Arial"/>
+                <w:bCs/>
+                <w:color w:val="000000"/>
+                <w:kern w:val="0"/>
+                <w:sz w:val="18"/>
+                <w:szCs w:val="18"/>
+              </w:rPr>
+            </w:pPr>
+            <w:r>
+              <w:rPr>
+                <w:rFonts w:ascii="微软雅黑" w:eastAsia="微软雅黑" w:hAnsi="微软雅黑" w:cs="Arial" w:hint="eastAsia"/>
+                <w:bCs/>
+                <w:color w:val="000000"/>
+                <w:kern w:val="0"/>
+                <w:sz w:val="18"/>
+                <w:szCs w:val="18"/>
+              </w:rPr>
+              <w:t>$</w:t>
+            </w:r>
+            <w:r>
+              <w:rPr>
+                <w:rFonts w:ascii="微软雅黑" w:eastAsia="微软雅黑" w:hAnsi="微软雅黑" w:cs="Arial"/>
+                <w:bCs/>
+                <w:color w:val="000000"/>
+                <w:kern w:val="0"/>
+                <w:sz w:val="18"/>
+                <w:szCs w:val="18"/>
+              </w:rPr>
+              <w:t>{</w:t>
+            </w:r>
+            <w:proofErr w:type="spellStart"/>
+            <w:r>
+              <w:rPr>
+                <w:rFonts w:ascii="微软雅黑" w:eastAsia="微软雅黑" w:hAnsi="微软雅黑" w:cs="Arial"/>
+                <w:bCs/>
+                <w:color w:val="000000"/>
+                <w:kern w:val="0"/>
+                <w:sz w:val="18"/>
+                <w:szCs w:val="18"/>
+              </w:rPr>
+              <w:t>nQynj</w:t>
             </w:r>
             <w:proofErr w:type="spellEnd"/>
             <w:r>
@@ -1392,13 +1608,13 @@
             </w:pPr>
             <w:r>
               <w:rPr>
-                <w:rFonts w:ascii="微软雅黑" w:eastAsia="微软雅黑" w:hAnsi="微软雅黑" w:cs="Arial"/>
-                <w:color w:val="000000"/>
-                <w:kern w:val="0"/>
-                <w:sz w:val="18"/>
-                <w:szCs w:val="18"/>
-              </w:rPr>
-              <w:t>绩效工资</w:t>
+                <w:rFonts w:ascii="微软雅黑" w:eastAsia="微软雅黑" w:hAnsi="微软雅黑" w:cs="Arial" w:hint="eastAsia"/>
+                <w:color w:val="000000"/>
+                <w:kern w:val="0"/>
+                <w:sz w:val="18"/>
+                <w:szCs w:val="18"/>
+              </w:rPr>
+              <w:t>年资津贴</w:t>
             </w:r>
           </w:p>
         </w:tc>
@@ -1421,13 +1637,65 @@
             </w:pPr>
             <w:r>
               <w:rPr>
-                <w:rFonts w:ascii="微软雅黑" w:eastAsia="微软雅黑" w:hAnsi="微软雅黑" w:cs="Arial"/>
-                <w:color w:val="000000"/>
-                <w:kern w:val="0"/>
-                <w:sz w:val="18"/>
-                <w:szCs w:val="18"/>
-              </w:rPr>
-              <w:t>****</w:t>
+                <w:rFonts w:ascii="微软雅黑" w:eastAsia="微软雅黑" w:hAnsi="微软雅黑" w:cs="Arial" w:hint="eastAsia"/>
+                <w:color w:val="000000"/>
+                <w:kern w:val="0"/>
+                <w:sz w:val="18"/>
+                <w:szCs w:val="18"/>
+              </w:rPr>
+              <w:t>$</w:t>
+            </w:r>
+            <w:r>
+              <w:rPr>
+                <w:rFonts w:ascii="微软雅黑" w:eastAsia="微软雅黑" w:hAnsi="微软雅黑" w:cs="Arial"/>
+                <w:color w:val="000000"/>
+                <w:kern w:val="0"/>
+                <w:sz w:val="18"/>
+                <w:szCs w:val="18"/>
+              </w:rPr>
+              <w:t>{</w:t>
+            </w:r>
+            <w:proofErr w:type="spellStart"/>
+            <w:r>
+              <w:rPr>
+                <w:rFonts w:ascii="微软雅黑" w:eastAsia="微软雅黑" w:hAnsi="微软雅黑" w:cs="Arial"/>
+                <w:color w:val="000000"/>
+                <w:kern w:val="0"/>
+                <w:sz w:val="18"/>
+                <w:szCs w:val="18"/>
+              </w:rPr>
+              <w:t>n</w:t>
+            </w:r>
+            <w:r>
+              <w:rPr>
+                <w:rFonts w:ascii="微软雅黑" w:eastAsia="微软雅黑" w:hAnsi="微软雅黑" w:cs="Arial" w:hint="eastAsia"/>
+                <w:color w:val="000000"/>
+                <w:kern w:val="0"/>
+                <w:sz w:val="18"/>
+                <w:szCs w:val="18"/>
+              </w:rPr>
+              <w:t>N</w:t>
+            </w:r>
+            <w:r>
+              <w:rPr>
+                <w:rFonts w:ascii="微软雅黑" w:eastAsia="微软雅黑" w:hAnsi="微软雅黑" w:cs="Arial"/>
+                <w:color w:val="000000"/>
+                <w:kern w:val="0"/>
+                <w:sz w:val="18"/>
+                <w:szCs w:val="18"/>
+              </w:rPr>
+              <w:t>zjt</w:t>
+            </w:r>
+            <w:proofErr w:type="spellEnd"/>
+            <w:r>
+              <w:rPr>
+                <w:rFonts w:ascii="微软雅黑" w:eastAsia="微软雅黑" w:hAnsi="微软雅黑" w:cs="Arial"/>
+                <w:color w:val="000000"/>
+                <w:kern w:val="0"/>
+                <w:sz w:val="18"/>
+                <w:szCs w:val="18"/>
+              </w:rPr>
+              <w:t>}</w:t>
             </w:r>
           </w:p>
         </w:tc>
@@ -1450,13 +1718,23 @@
             </w:pPr>
             <w:r>
               <w:rPr>
-                <w:rFonts w:ascii="微软雅黑" w:eastAsia="微软雅黑" w:hAnsi="微软雅黑" w:cs="Arial"/>
-                <w:color w:val="000000"/>
-                <w:kern w:val="0"/>
-                <w:sz w:val="18"/>
-                <w:szCs w:val="18"/>
-              </w:rPr>
-              <w:t>公积金个人扣款</w:t>
+                <w:rFonts w:ascii="微软雅黑" w:eastAsia="微软雅黑" w:hAnsi="微软雅黑" w:cs="Arial" w:hint="eastAsia"/>
+                <w:color w:val="000000"/>
+                <w:kern w:val="0"/>
+                <w:sz w:val="18"/>
+                <w:szCs w:val="18"/>
+              </w:rPr>
+              <w:t>个人</w:t>
+            </w:r>
+            <w:r>
+              <w:rPr>
+                <w:rFonts w:ascii="微软雅黑" w:eastAsia="微软雅黑" w:hAnsi="微软雅黑" w:cs="Arial"/>
+                <w:color w:val="000000"/>
+                <w:kern w:val="0"/>
+                <w:sz w:val="18"/>
+                <w:szCs w:val="18"/>
+              </w:rPr>
+              <w:t>所得税</w:t>
             </w:r>
           </w:p>
         </w:tc>
@@ -1468,6 +1746,7 @@
           <w:p>
             <w:pPr>
               <w:widowControl/>
+              <w:ind w:right="27"/>
               <w:jc w:val="center"/>
               <w:rPr>
                 <w:rFonts w:ascii="微软雅黑" w:eastAsia="微软雅黑" w:hAnsi="微软雅黑" w:cs="Arial"/>
@@ -1481,7 +1760,6 @@
             <w:r>
               <w:rPr>
                 <w:rFonts w:ascii="微软雅黑" w:eastAsia="微软雅黑" w:hAnsi="微软雅黑" w:cs="Arial" w:hint="eastAsia"/>
-                <w:bCs/>
                 <w:color w:val="000000"/>
                 <w:kern w:val="0"/>
                 <w:sz w:val="18"/>
@@ -1492,7 +1770,6 @@
             <w:r>
               <w:rPr>
                 <w:rFonts w:ascii="微软雅黑" w:eastAsia="微软雅黑" w:hAnsi="微软雅黑" w:cs="Arial"/>
-                <w:bCs/>
                 <w:color w:val="000000"/>
                 <w:kern w:val="0"/>
                 <w:sz w:val="18"/>
@@ -1504,19 +1781,17 @@
             <w:r>
               <w:rPr>
                 <w:rFonts w:ascii="微软雅黑" w:eastAsia="微软雅黑" w:hAnsi="微软雅黑" w:cs="Arial"/>
-                <w:bCs/>
-                <w:color w:val="000000"/>
-                <w:kern w:val="0"/>
-                <w:sz w:val="18"/>
-                <w:szCs w:val="18"/>
-              </w:rPr>
-              <w:t>nGjjgrkk</w:t>
+                <w:color w:val="000000"/>
+                <w:kern w:val="0"/>
+                <w:sz w:val="18"/>
+                <w:szCs w:val="18"/>
+              </w:rPr>
+              <w:t>nGrsds</w:t>
             </w:r>
             <w:proofErr w:type="spellEnd"/>
             <w:r>
               <w:rPr>
                 <w:rFonts w:ascii="微软雅黑" w:eastAsia="微软雅黑" w:hAnsi="微软雅黑" w:cs="Arial"/>
-                <w:bCs/>
                 <w:color w:val="000000"/>
                 <w:kern w:val="0"/>
                 <w:sz w:val="18"/>
@@ -1556,7 +1831,7 @@
                 <w:sz w:val="18"/>
                 <w:szCs w:val="18"/>
               </w:rPr>
-              <w:t>绩效实发工资</w:t>
+              <w:t>奖励</w:t>
             </w:r>
           </w:p>
         </w:tc>
@@ -1579,17 +1854,103 @@
             </w:pPr>
             <w:r>
               <w:rPr>
+                <w:rFonts w:ascii="微软雅黑" w:eastAsia="微软雅黑" w:hAnsi="微软雅黑" w:cs="Arial"/>
+                <w:bCs/>
+                <w:color w:val="000000"/>
+                <w:kern w:val="0"/>
+                <w:sz w:val="18"/>
+                <w:szCs w:val="18"/>
+              </w:rPr>
+              <w:t>${</w:t>
+            </w:r>
+            <w:proofErr w:type="spellStart"/>
+            <w:r>
+              <w:rPr>
+                <w:rFonts w:ascii="微软雅黑" w:eastAsia="微软雅黑" w:hAnsi="微软雅黑" w:cs="Arial"/>
+                <w:bCs/>
+                <w:color w:val="000000"/>
+                <w:kern w:val="0"/>
+                <w:sz w:val="18"/>
+                <w:szCs w:val="18"/>
+              </w:rPr>
+              <w:t>salary_increase</w:t>
+            </w:r>
+            <w:proofErr w:type="spellEnd"/>
+            <w:r>
+              <w:rPr>
+                <w:rFonts w:ascii="微软雅黑" w:eastAsia="微软雅黑" w:hAnsi="微软雅黑" w:cs="Arial"/>
+                <w:bCs/>
+                <w:color w:val="000000"/>
+                <w:kern w:val="0"/>
+                <w:sz w:val="18"/>
+                <w:szCs w:val="18"/>
+              </w:rPr>
+              <w:t>}</w:t>
+            </w:r>
+          </w:p>
+        </w:tc>
+        <w:tc>
+          <w:tcPr>
+            <w:tcW w:w="2460" w:type="dxa"/>
+            <w:vAlign w:val="center"/>
+          </w:tcPr>
+          <w:p>
+            <w:pPr>
+              <w:widowControl/>
+              <w:jc w:val="left"/>
+              <w:rPr>
+                <w:rFonts w:ascii="微软雅黑" w:eastAsia="微软雅黑" w:hAnsi="微软雅黑" w:cs="Arial"/>
+                <w:color w:val="000000"/>
+                <w:kern w:val="0"/>
+                <w:sz w:val="18"/>
+                <w:szCs w:val="18"/>
+              </w:rPr>
+            </w:pPr>
+            <w:r>
+              <w:rPr>
                 <w:rFonts w:ascii="微软雅黑" w:eastAsia="微软雅黑" w:hAnsi="微软雅黑" w:cs="Arial" w:hint="eastAsia"/>
                 <w:color w:val="000000"/>
                 <w:kern w:val="0"/>
                 <w:sz w:val="18"/>
                 <w:szCs w:val="18"/>
               </w:rPr>
+              <w:t>工会费</w:t>
+            </w:r>
+          </w:p>
+        </w:tc>
+        <w:tc>
+          <w:tcPr>
+            <w:tcW w:w="2569" w:type="dxa"/>
+            <w:vAlign w:val="center"/>
+          </w:tcPr>
+          <w:p>
+            <w:pPr>
+              <w:widowControl/>
+              <w:jc w:val="center"/>
+              <w:rPr>
+                <w:rFonts w:ascii="微软雅黑" w:eastAsia="微软雅黑" w:hAnsi="微软雅黑" w:cs="Arial"/>
+                <w:bCs/>
+                <w:color w:val="000000"/>
+                <w:kern w:val="0"/>
+                <w:sz w:val="18"/>
+                <w:szCs w:val="18"/>
+              </w:rPr>
+            </w:pPr>
+            <w:r>
+              <w:rPr>
+                <w:rFonts w:ascii="微软雅黑" w:eastAsia="微软雅黑" w:hAnsi="微软雅黑" w:cs="Arial" w:hint="eastAsia"/>
+                <w:bCs/>
+                <w:color w:val="000000"/>
+                <w:kern w:val="0"/>
+                <w:sz w:val="18"/>
+                <w:szCs w:val="18"/>
+              </w:rPr>
               <w:t>$</w:t>
             </w:r>
             <w:r>
               <w:rPr>
                 <w:rFonts w:ascii="微软雅黑" w:eastAsia="微软雅黑" w:hAnsi="微软雅黑" w:cs="Arial"/>
+                <w:bCs/>
                 <w:color w:val="000000"/>
                 <w:kern w:val="0"/>
                 <w:sz w:val="18"/>
@@ -1601,106 +1962,13 @@
             <w:r>
               <w:rPr>
                 <w:rFonts w:ascii="微软雅黑" w:eastAsia="微软雅黑" w:hAnsi="微软雅黑" w:cs="Arial"/>
-                <w:color w:val="000000"/>
-                <w:kern w:val="0"/>
-                <w:sz w:val="18"/>
-                <w:szCs w:val="18"/>
-              </w:rPr>
-              <w:t>nJiXiao</w:t>
-            </w:r>
-            <w:proofErr w:type="spellEnd"/>
-            <w:r>
-              <w:rPr>
-                <w:rFonts w:ascii="微软雅黑" w:eastAsia="微软雅黑" w:hAnsi="微软雅黑" w:cs="Arial"/>
-                <w:color w:val="000000"/>
-                <w:kern w:val="0"/>
-                <w:sz w:val="18"/>
-                <w:szCs w:val="18"/>
-              </w:rPr>
-              <w:t>}</w:t>
-            </w:r>
-          </w:p>
-        </w:tc>
-        <w:tc>
-          <w:tcPr>
-            <w:tcW w:w="2460" w:type="dxa"/>
-            <w:vAlign w:val="center"/>
-          </w:tcPr>
-          <w:p>
-            <w:pPr>
-              <w:widowControl/>
-              <w:jc w:val="left"/>
-              <w:rPr>
-                <w:rFonts w:ascii="微软雅黑" w:eastAsia="微软雅黑" w:hAnsi="微软雅黑" w:cs="Arial"/>
-                <w:color w:val="000000"/>
-                <w:kern w:val="0"/>
-                <w:sz w:val="18"/>
-                <w:szCs w:val="18"/>
-              </w:rPr>
-            </w:pPr>
-            <w:r>
-              <w:rPr>
-                <w:rFonts w:ascii="微软雅黑" w:eastAsia="微软雅黑" w:hAnsi="微软雅黑" w:cs="Arial" w:hint="eastAsia"/>
-                <w:color w:val="000000"/>
-                <w:kern w:val="0"/>
-                <w:sz w:val="18"/>
-                <w:szCs w:val="18"/>
-              </w:rPr>
-              <w:t>企业年金个人扣款</w:t>
-            </w:r>
-          </w:p>
-        </w:tc>
-        <w:tc>
-          <w:tcPr>
-            <w:tcW w:w="2569" w:type="dxa"/>
-            <w:vAlign w:val="center"/>
-          </w:tcPr>
-          <w:p>
-            <w:pPr>
-              <w:widowControl/>
-              <w:jc w:val="center"/>
-              <w:rPr>
-                <w:rFonts w:ascii="微软雅黑" w:eastAsia="微软雅黑" w:hAnsi="微软雅黑" w:cs="Arial"/>
-                <w:bCs/>
-                <w:color w:val="000000"/>
-                <w:kern w:val="0"/>
-                <w:sz w:val="18"/>
-                <w:szCs w:val="18"/>
-              </w:rPr>
-            </w:pPr>
-            <w:r>
-              <w:rPr>
-                <w:rFonts w:ascii="微软雅黑" w:eastAsia="微软雅黑" w:hAnsi="微软雅黑" w:cs="Arial" w:hint="eastAsia"/>
-                <w:bCs/>
-                <w:color w:val="000000"/>
-                <w:kern w:val="0"/>
-                <w:sz w:val="18"/>
-                <w:szCs w:val="18"/>
-              </w:rPr>
-              <w:t>$</w:t>
-            </w:r>
-            <w:r>
-              <w:rPr>
-                <w:rFonts w:ascii="微软雅黑" w:eastAsia="微软雅黑" w:hAnsi="微软雅黑" w:cs="Arial"/>
-                <w:bCs/>
-                <w:color w:val="000000"/>
-                <w:kern w:val="0"/>
-                <w:sz w:val="18"/>
-                <w:szCs w:val="18"/>
-              </w:rPr>
-              <w:t>{</w:t>
-            </w:r>
-            <w:proofErr w:type="spellStart"/>
-            <w:r>
-              <w:rPr>
-                <w:rFonts w:ascii="微软雅黑" w:eastAsia="微软雅黑" w:hAnsi="微软雅黑" w:cs="Arial"/>
-                <w:bCs/>
-                <w:color w:val="000000"/>
-                <w:kern w:val="0"/>
-                <w:sz w:val="18"/>
-                <w:szCs w:val="18"/>
-              </w:rPr>
-              <w:t>nQynj</w:t>
+                <w:bCs/>
+                <w:color w:val="000000"/>
+                <w:kern w:val="0"/>
+                <w:sz w:val="18"/>
+                <w:szCs w:val="18"/>
+              </w:rPr>
+              <w:t>nGhf</w:t>
             </w:r>
             <w:proofErr w:type="spellEnd"/>
             <w:r>
@@ -1746,7 +2014,7 @@
                 <w:sz w:val="18"/>
                 <w:szCs w:val="18"/>
               </w:rPr>
-              <w:t>年资津贴</w:t>
+              <w:t>防寒暑费</w:t>
             </w:r>
           </w:p>
         </w:tc>
@@ -1796,8 +2064,38 @@
                 <w:sz w:val="18"/>
                 <w:szCs w:val="18"/>
               </w:rPr>
-              <w:t>n</w:t>
-            </w:r>
+              <w:t>nFhsf</w:t>
+            </w:r>
+            <w:proofErr w:type="spellEnd"/>
+            <w:r>
+              <w:rPr>
+                <w:rFonts w:ascii="微软雅黑" w:eastAsia="微软雅黑" w:hAnsi="微软雅黑" w:cs="Arial"/>
+                <w:color w:val="000000"/>
+                <w:kern w:val="0"/>
+                <w:sz w:val="18"/>
+                <w:szCs w:val="18"/>
+              </w:rPr>
+              <w:t>}</w:t>
+            </w:r>
+          </w:p>
+        </w:tc>
+        <w:tc>
+          <w:tcPr>
+            <w:tcW w:w="2460" w:type="dxa"/>
+            <w:vAlign w:val="center"/>
+          </w:tcPr>
+          <w:p>
+            <w:pPr>
+              <w:widowControl/>
+              <w:jc w:val="left"/>
+              <w:rPr>
+                <w:rFonts w:ascii="微软雅黑" w:eastAsia="微软雅黑" w:hAnsi="微软雅黑" w:cs="Arial"/>
+                <w:color w:val="000000"/>
+                <w:kern w:val="0"/>
+                <w:sz w:val="18"/>
+                <w:szCs w:val="18"/>
+              </w:rPr>
+            </w:pPr>
             <w:r>
               <w:rPr>
                 <w:rFonts w:ascii="微软雅黑" w:eastAsia="微软雅黑" w:hAnsi="微软雅黑" w:cs="Arial" w:hint="eastAsia"/>
@@ -1806,67 +2104,7 @@
                 <w:sz w:val="18"/>
                 <w:szCs w:val="18"/>
               </w:rPr>
-              <w:t>N</w:t>
-            </w:r>
-            <w:r>
-              <w:rPr>
-                <w:rFonts w:ascii="微软雅黑" w:eastAsia="微软雅黑" w:hAnsi="微软雅黑" w:cs="Arial"/>
-                <w:color w:val="000000"/>
-                <w:kern w:val="0"/>
-                <w:sz w:val="18"/>
-                <w:szCs w:val="18"/>
-              </w:rPr>
-              <w:t>zjt</w:t>
-            </w:r>
-            <w:proofErr w:type="spellEnd"/>
-            <w:r>
-              <w:rPr>
-                <w:rFonts w:ascii="微软雅黑" w:eastAsia="微软雅黑" w:hAnsi="微软雅黑" w:cs="Arial"/>
-                <w:color w:val="000000"/>
-                <w:kern w:val="0"/>
-                <w:sz w:val="18"/>
-                <w:szCs w:val="18"/>
-              </w:rPr>
-              <w:t>}</w:t>
-            </w:r>
-          </w:p>
-        </w:tc>
-        <w:tc>
-          <w:tcPr>
-            <w:tcW w:w="2460" w:type="dxa"/>
-            <w:vAlign w:val="center"/>
-          </w:tcPr>
-          <w:p>
-            <w:pPr>
-              <w:widowControl/>
-              <w:jc w:val="left"/>
-              <w:rPr>
-                <w:rFonts w:ascii="微软雅黑" w:eastAsia="微软雅黑" w:hAnsi="微软雅黑" w:cs="Arial"/>
-                <w:color w:val="000000"/>
-                <w:kern w:val="0"/>
-                <w:sz w:val="18"/>
-                <w:szCs w:val="18"/>
-              </w:rPr>
-            </w:pPr>
-            <w:r>
-              <w:rPr>
-                <w:rFonts w:ascii="微软雅黑" w:eastAsia="微软雅黑" w:hAnsi="微软雅黑" w:cs="Arial" w:hint="eastAsia"/>
-                <w:color w:val="000000"/>
-                <w:kern w:val="0"/>
-                <w:sz w:val="18"/>
-                <w:szCs w:val="18"/>
-              </w:rPr>
-              <w:t>个人</w:t>
-            </w:r>
-            <w:r>
-              <w:rPr>
-                <w:rFonts w:ascii="微软雅黑" w:eastAsia="微软雅黑" w:hAnsi="微软雅黑" w:cs="Arial"/>
-                <w:color w:val="000000"/>
-                <w:kern w:val="0"/>
-                <w:sz w:val="18"/>
-                <w:szCs w:val="18"/>
-              </w:rPr>
-              <w:t>所得税</w:t>
+              <w:t>房租费</w:t>
             </w:r>
           </w:p>
         </w:tc>
@@ -1892,6 +2130,7 @@
             <w:r>
               <w:rPr>
                 <w:rFonts w:ascii="微软雅黑" w:eastAsia="微软雅黑" w:hAnsi="微软雅黑" w:cs="Arial" w:hint="eastAsia"/>
+                <w:bCs/>
                 <w:color w:val="000000"/>
                 <w:kern w:val="0"/>
                 <w:sz w:val="18"/>
@@ -1902,6 +2141,7 @@
             <w:r>
               <w:rPr>
                 <w:rFonts w:ascii="微软雅黑" w:eastAsia="微软雅黑" w:hAnsi="微软雅黑" w:cs="Arial"/>
+                <w:bCs/>
                 <w:color w:val="000000"/>
                 <w:kern w:val="0"/>
                 <w:sz w:val="18"/>
@@ -1913,17 +2153,19 @@
             <w:r>
               <w:rPr>
                 <w:rFonts w:ascii="微软雅黑" w:eastAsia="微软雅黑" w:hAnsi="微软雅黑" w:cs="Arial"/>
-                <w:color w:val="000000"/>
-                <w:kern w:val="0"/>
-                <w:sz w:val="18"/>
-                <w:szCs w:val="18"/>
-              </w:rPr>
-              <w:t>nGrsds</w:t>
+                <w:bCs/>
+                <w:color w:val="000000"/>
+                <w:kern w:val="0"/>
+                <w:sz w:val="18"/>
+                <w:szCs w:val="18"/>
+              </w:rPr>
+              <w:t>nFzf</w:t>
             </w:r>
             <w:proofErr w:type="spellEnd"/>
             <w:r>
               <w:rPr>
                 <w:rFonts w:ascii="微软雅黑" w:eastAsia="微软雅黑" w:hAnsi="微软雅黑" w:cs="Arial"/>
+                <w:bCs/>
                 <w:color w:val="000000"/>
                 <w:kern w:val="0"/>
                 <w:sz w:val="18"/>
@@ -1963,7 +2205,7 @@
                 <w:sz w:val="18"/>
                 <w:szCs w:val="18"/>
               </w:rPr>
-              <w:t>奖励</w:t>
+              <w:t>节日费</w:t>
             </w:r>
           </w:p>
         </w:tc>
@@ -1987,7 +2229,6 @@
             <w:r>
               <w:rPr>
                 <w:rFonts w:ascii="微软雅黑" w:eastAsia="微软雅黑" w:hAnsi="微软雅黑" w:cs="Arial"/>
-                <w:bCs/>
                 <w:color w:val="000000"/>
                 <w:kern w:val="0"/>
                 <w:sz w:val="18"/>
@@ -1999,19 +2240,17 @@
             <w:r>
               <w:rPr>
                 <w:rFonts w:ascii="微软雅黑" w:eastAsia="微软雅黑" w:hAnsi="微软雅黑" w:cs="Arial"/>
-                <w:bCs/>
-                <w:color w:val="000000"/>
-                <w:kern w:val="0"/>
-                <w:sz w:val="18"/>
-                <w:szCs w:val="18"/>
-              </w:rPr>
-              <w:t>salary_increase</w:t>
+                <w:color w:val="000000"/>
+                <w:kern w:val="0"/>
+                <w:sz w:val="18"/>
+                <w:szCs w:val="18"/>
+              </w:rPr>
+              <w:t>nJrf</w:t>
             </w:r>
             <w:proofErr w:type="spellEnd"/>
             <w:r>
               <w:rPr>
                 <w:rFonts w:ascii="微软雅黑" w:eastAsia="微软雅黑" w:hAnsi="微软雅黑" w:cs="Arial"/>
-                <w:bCs/>
                 <w:color w:val="000000"/>
                 <w:kern w:val="0"/>
                 <w:sz w:val="18"/>
@@ -2038,6 +2277,7 @@
                 <w:szCs w:val="18"/>
               </w:rPr>
             </w:pPr>
+            <w:proofErr w:type="gramStart"/>
             <w:r>
               <w:rPr>
                 <w:rFonts w:ascii="微软雅黑" w:eastAsia="微软雅黑" w:hAnsi="微软雅黑" w:cs="Arial" w:hint="eastAsia"/>
@@ -2046,8 +2286,9 @@
                 <w:sz w:val="18"/>
                 <w:szCs w:val="18"/>
               </w:rPr>
-              <w:t>工会费</w:t>
-            </w:r>
+              <w:t>物业费</w:t>
+            </w:r>
+            <w:proofErr w:type="gramEnd"/>
           </w:p>
         </w:tc>
         <w:tc>
@@ -2061,52 +2302,37 @@
               <w:jc w:val="center"/>
               <w:rPr>
                 <w:rFonts w:ascii="微软雅黑" w:eastAsia="微软雅黑" w:hAnsi="微软雅黑" w:cs="Arial"/>
-                <w:bCs/>
-                <w:color w:val="000000"/>
-                <w:kern w:val="0"/>
-                <w:sz w:val="18"/>
-                <w:szCs w:val="18"/>
-              </w:rPr>
-            </w:pPr>
-            <w:r>
-              <w:rPr>
-                <w:rFonts w:ascii="微软雅黑" w:eastAsia="微软雅黑" w:hAnsi="微软雅黑" w:cs="Arial" w:hint="eastAsia"/>
-                <w:bCs/>
-                <w:color w:val="000000"/>
-                <w:kern w:val="0"/>
-                <w:sz w:val="18"/>
-                <w:szCs w:val="18"/>
-              </w:rPr>
-              <w:t>$</w:t>
-            </w:r>
-            <w:r>
-              <w:rPr>
-                <w:rFonts w:ascii="微软雅黑" w:eastAsia="微软雅黑" w:hAnsi="微软雅黑" w:cs="Arial"/>
-                <w:bCs/>
-                <w:color w:val="000000"/>
-                <w:kern w:val="0"/>
-                <w:sz w:val="18"/>
-                <w:szCs w:val="18"/>
-              </w:rPr>
-              <w:t>{</w:t>
+                <w:color w:val="000000"/>
+                <w:kern w:val="0"/>
+                <w:sz w:val="18"/>
+                <w:szCs w:val="18"/>
+              </w:rPr>
+            </w:pPr>
+            <w:r>
+              <w:rPr>
+                <w:rFonts w:ascii="微软雅黑" w:eastAsia="微软雅黑" w:hAnsi="微软雅黑" w:cs="Arial"/>
+                <w:color w:val="000000"/>
+                <w:kern w:val="0"/>
+                <w:sz w:val="18"/>
+                <w:szCs w:val="18"/>
+              </w:rPr>
+              <w:t>${</w:t>
             </w:r>
             <w:proofErr w:type="spellStart"/>
             <w:r>
               <w:rPr>
                 <w:rFonts w:ascii="微软雅黑" w:eastAsia="微软雅黑" w:hAnsi="微软雅黑" w:cs="Arial"/>
-                <w:bCs/>
-                <w:color w:val="000000"/>
-                <w:kern w:val="0"/>
-                <w:sz w:val="18"/>
-                <w:szCs w:val="18"/>
-              </w:rPr>
-              <w:t>nGhf</w:t>
+                <w:color w:val="000000"/>
+                <w:kern w:val="0"/>
+                <w:sz w:val="18"/>
+                <w:szCs w:val="18"/>
+              </w:rPr>
+              <w:t>nWyf</w:t>
             </w:r>
             <w:proofErr w:type="spellEnd"/>
             <w:r>
               <w:rPr>
                 <w:rFonts w:ascii="微软雅黑" w:eastAsia="微软雅黑" w:hAnsi="微软雅黑" w:cs="Arial"/>
-                <w:bCs/>
                 <w:color w:val="000000"/>
                 <w:kern w:val="0"/>
                 <w:sz w:val="18"/>
@@ -2140,13 +2366,79 @@
             </w:pPr>
             <w:r>
               <w:rPr>
+                <w:rFonts w:ascii="微软雅黑" w:eastAsia="微软雅黑" w:hAnsi="微软雅黑" w:cs="Arial"/>
+                <w:color w:val="000000"/>
+                <w:kern w:val="0"/>
+                <w:sz w:val="18"/>
+                <w:szCs w:val="18"/>
+              </w:rPr>
+              <w:t>养老个人扣款</w:t>
+            </w:r>
+          </w:p>
+        </w:tc>
+        <w:tc>
+          <w:tcPr>
+            <w:tcW w:w="2460" w:type="dxa"/>
+            <w:vAlign w:val="center"/>
+          </w:tcPr>
+          <w:p>
+            <w:pPr>
+              <w:widowControl/>
+              <w:jc w:val="center"/>
+              <w:rPr>
+                <w:rFonts w:ascii="微软雅黑" w:eastAsia="微软雅黑" w:hAnsi="微软雅黑" w:cs="Arial"/>
+                <w:bCs/>
+                <w:color w:val="000000"/>
+                <w:kern w:val="0"/>
+                <w:sz w:val="18"/>
+                <w:szCs w:val="18"/>
+              </w:rPr>
+            </w:pPr>
+            <w:r>
+              <w:rPr>
                 <w:rFonts w:ascii="微软雅黑" w:eastAsia="微软雅黑" w:hAnsi="微软雅黑" w:cs="Arial" w:hint="eastAsia"/>
-                <w:color w:val="000000"/>
-                <w:kern w:val="0"/>
-                <w:sz w:val="18"/>
-                <w:szCs w:val="18"/>
-              </w:rPr>
-              <w:t>防寒暑费</w:t>
+                <w:bCs/>
+                <w:color w:val="000000"/>
+                <w:kern w:val="0"/>
+                <w:sz w:val="18"/>
+                <w:szCs w:val="18"/>
+              </w:rPr>
+              <w:t>$</w:t>
+            </w:r>
+            <w:r>
+              <w:rPr>
+                <w:rFonts w:ascii="微软雅黑" w:eastAsia="微软雅黑" w:hAnsi="微软雅黑" w:cs="Arial"/>
+                <w:bCs/>
+                <w:color w:val="000000"/>
+                <w:kern w:val="0"/>
+                <w:sz w:val="18"/>
+                <w:szCs w:val="18"/>
+              </w:rPr>
+              <w:t>{</w:t>
+            </w:r>
+            <w:proofErr w:type="spellStart"/>
+            <w:r>
+              <w:rPr>
+                <w:rFonts w:ascii="微软雅黑" w:eastAsia="微软雅黑" w:hAnsi="微软雅黑" w:cs="Arial"/>
+                <w:bCs/>
+                <w:color w:val="000000"/>
+                <w:kern w:val="0"/>
+                <w:sz w:val="18"/>
+                <w:szCs w:val="18"/>
+              </w:rPr>
+              <w:t>nEndowment</w:t>
+            </w:r>
+            <w:proofErr w:type="spellEnd"/>
+            <w:r>
+              <w:rPr>
+                <w:rFonts w:ascii="微软雅黑" w:eastAsia="微软雅黑" w:hAnsi="微软雅黑" w:cs="Arial"/>
+                <w:bCs/>
+                <w:color w:val="000000"/>
+                <w:kern w:val="0"/>
+                <w:sz w:val="18"/>
+                <w:szCs w:val="18"/>
+              </w:rPr>
+              <w:t>}</w:t>
             </w:r>
           </w:p>
         </w:tc>
@@ -2158,6 +2450,35 @@
           <w:p>
             <w:pPr>
               <w:widowControl/>
+              <w:jc w:val="left"/>
+              <w:rPr>
+                <w:rFonts w:ascii="微软雅黑" w:eastAsia="微软雅黑" w:hAnsi="微软雅黑" w:cs="Arial"/>
+                <w:color w:val="000000"/>
+                <w:kern w:val="0"/>
+                <w:sz w:val="18"/>
+                <w:szCs w:val="18"/>
+              </w:rPr>
+            </w:pPr>
+            <w:r>
+              <w:rPr>
+                <w:rFonts w:ascii="微软雅黑" w:eastAsia="微软雅黑" w:hAnsi="微软雅黑" w:cs="Arial" w:hint="eastAsia"/>
+                <w:color w:val="000000"/>
+                <w:kern w:val="0"/>
+                <w:sz w:val="18"/>
+                <w:szCs w:val="18"/>
+              </w:rPr>
+              <w:t>电费</w:t>
+            </w:r>
+          </w:p>
+        </w:tc>
+        <w:tc>
+          <w:tcPr>
+            <w:tcW w:w="2569" w:type="dxa"/>
+            <w:vAlign w:val="center"/>
+          </w:tcPr>
+          <w:p>
+            <w:pPr>
+              <w:widowControl/>
               <w:jc w:val="center"/>
               <w:rPr>
                 <w:rFonts w:ascii="微软雅黑" w:eastAsia="微软雅黑" w:hAnsi="微软雅黑" w:cs="Arial"/>
@@ -2169,23 +2490,13 @@
             </w:pPr>
             <w:r>
               <w:rPr>
-                <w:rFonts w:ascii="微软雅黑" w:eastAsia="微软雅黑" w:hAnsi="微软雅黑" w:cs="Arial" w:hint="eastAsia"/>
-                <w:color w:val="000000"/>
-                <w:kern w:val="0"/>
-                <w:sz w:val="18"/>
-                <w:szCs w:val="18"/>
-              </w:rPr>
-              <w:t>$</w:t>
-            </w:r>
-            <w:r>
-              <w:rPr>
-                <w:rFonts w:ascii="微软雅黑" w:eastAsia="微软雅黑" w:hAnsi="微软雅黑" w:cs="Arial"/>
-                <w:color w:val="000000"/>
-                <w:kern w:val="0"/>
-                <w:sz w:val="18"/>
-                <w:szCs w:val="18"/>
-              </w:rPr>
-              <w:t>{</w:t>
+                <w:rFonts w:ascii="微软雅黑" w:eastAsia="微软雅黑" w:hAnsi="微软雅黑" w:cs="Arial"/>
+                <w:color w:val="000000"/>
+                <w:kern w:val="0"/>
+                <w:sz w:val="18"/>
+                <w:szCs w:val="18"/>
+              </w:rPr>
+              <w:t>${</w:t>
             </w:r>
             <w:proofErr w:type="spellStart"/>
             <w:r>
@@ -2196,108 +2507,12 @@
                 <w:sz w:val="18"/>
                 <w:szCs w:val="18"/>
               </w:rPr>
-              <w:t>nFhsf</w:t>
+              <w:t>nDf</w:t>
             </w:r>
             <w:proofErr w:type="spellEnd"/>
             <w:r>
               <w:rPr>
                 <w:rFonts w:ascii="微软雅黑" w:eastAsia="微软雅黑" w:hAnsi="微软雅黑" w:cs="Arial"/>
-                <w:color w:val="000000"/>
-                <w:kern w:val="0"/>
-                <w:sz w:val="18"/>
-                <w:szCs w:val="18"/>
-              </w:rPr>
-              <w:t>}</w:t>
-            </w:r>
-          </w:p>
-        </w:tc>
-        <w:tc>
-          <w:tcPr>
-            <w:tcW w:w="2460" w:type="dxa"/>
-            <w:vAlign w:val="center"/>
-          </w:tcPr>
-          <w:p>
-            <w:pPr>
-              <w:widowControl/>
-              <w:jc w:val="left"/>
-              <w:rPr>
-                <w:rFonts w:ascii="微软雅黑" w:eastAsia="微软雅黑" w:hAnsi="微软雅黑" w:cs="Arial"/>
-                <w:color w:val="000000"/>
-                <w:kern w:val="0"/>
-                <w:sz w:val="18"/>
-                <w:szCs w:val="18"/>
-              </w:rPr>
-            </w:pPr>
-            <w:r>
-              <w:rPr>
-                <w:rFonts w:ascii="微软雅黑" w:eastAsia="微软雅黑" w:hAnsi="微软雅黑" w:cs="Arial" w:hint="eastAsia"/>
-                <w:color w:val="000000"/>
-                <w:kern w:val="0"/>
-                <w:sz w:val="18"/>
-                <w:szCs w:val="18"/>
-              </w:rPr>
-              <w:t>房租费</w:t>
-            </w:r>
-          </w:p>
-        </w:tc>
-        <w:tc>
-          <w:tcPr>
-            <w:tcW w:w="2569" w:type="dxa"/>
-            <w:vAlign w:val="center"/>
-          </w:tcPr>
-          <w:p>
-            <w:pPr>
-              <w:widowControl/>
-              <w:ind w:right="27"/>
-              <w:jc w:val="center"/>
-              <w:rPr>
-                <w:rFonts w:ascii="微软雅黑" w:eastAsia="微软雅黑" w:hAnsi="微软雅黑" w:cs="Arial"/>
-                <w:bCs/>
-                <w:color w:val="000000"/>
-                <w:kern w:val="0"/>
-                <w:sz w:val="18"/>
-                <w:szCs w:val="18"/>
-              </w:rPr>
-            </w:pPr>
-            <w:r>
-              <w:rPr>
-                <w:rFonts w:ascii="微软雅黑" w:eastAsia="微软雅黑" w:hAnsi="微软雅黑" w:cs="Arial" w:hint="eastAsia"/>
-                <w:bCs/>
-                <w:color w:val="000000"/>
-                <w:kern w:val="0"/>
-                <w:sz w:val="18"/>
-                <w:szCs w:val="18"/>
-              </w:rPr>
-              <w:t>$</w:t>
-            </w:r>
-            <w:r>
-              <w:rPr>
-                <w:rFonts w:ascii="微软雅黑" w:eastAsia="微软雅黑" w:hAnsi="微软雅黑" w:cs="Arial"/>
-                <w:bCs/>
-                <w:color w:val="000000"/>
-                <w:kern w:val="0"/>
-                <w:sz w:val="18"/>
-                <w:szCs w:val="18"/>
-              </w:rPr>
-              <w:t>{</w:t>
-            </w:r>
-            <w:proofErr w:type="spellStart"/>
-            <w:r>
-              <w:rPr>
-                <w:rFonts w:ascii="微软雅黑" w:eastAsia="微软雅黑" w:hAnsi="微软雅黑" w:cs="Arial"/>
-                <w:bCs/>
-                <w:color w:val="000000"/>
-                <w:kern w:val="0"/>
-                <w:sz w:val="18"/>
-                <w:szCs w:val="18"/>
-              </w:rPr>
-              <w:t>nFzf</w:t>
-            </w:r>
-            <w:proofErr w:type="spellEnd"/>
-            <w:r>
-              <w:rPr>
-                <w:rFonts w:ascii="微软雅黑" w:eastAsia="微软雅黑" w:hAnsi="微软雅黑" w:cs="Arial"/>
-                <w:bCs/>
                 <w:color w:val="000000"/>
                 <w:kern w:val="0"/>
                 <w:sz w:val="18"/>
@@ -2331,13 +2546,79 @@
             </w:pPr>
             <w:r>
               <w:rPr>
+                <w:rFonts w:ascii="微软雅黑" w:eastAsia="微软雅黑" w:hAnsi="微软雅黑" w:cs="Arial"/>
+                <w:color w:val="000000"/>
+                <w:kern w:val="0"/>
+                <w:sz w:val="18"/>
+                <w:szCs w:val="18"/>
+              </w:rPr>
+              <w:t>失业个人扣款</w:t>
+            </w:r>
+          </w:p>
+        </w:tc>
+        <w:tc>
+          <w:tcPr>
+            <w:tcW w:w="2460" w:type="dxa"/>
+            <w:vAlign w:val="center"/>
+          </w:tcPr>
+          <w:p>
+            <w:pPr>
+              <w:widowControl/>
+              <w:jc w:val="center"/>
+              <w:rPr>
+                <w:rFonts w:ascii="微软雅黑" w:eastAsia="微软雅黑" w:hAnsi="微软雅黑" w:cs="Arial"/>
+                <w:bCs/>
+                <w:color w:val="000000"/>
+                <w:kern w:val="0"/>
+                <w:sz w:val="18"/>
+                <w:szCs w:val="18"/>
+              </w:rPr>
+            </w:pPr>
+            <w:r>
+              <w:rPr>
                 <w:rFonts w:ascii="微软雅黑" w:eastAsia="微软雅黑" w:hAnsi="微软雅黑" w:cs="Arial" w:hint="eastAsia"/>
-                <w:color w:val="000000"/>
-                <w:kern w:val="0"/>
-                <w:sz w:val="18"/>
-                <w:szCs w:val="18"/>
-              </w:rPr>
-              <w:t>节日费</w:t>
+                <w:bCs/>
+                <w:color w:val="000000"/>
+                <w:kern w:val="0"/>
+                <w:sz w:val="18"/>
+                <w:szCs w:val="18"/>
+              </w:rPr>
+              <w:t>$</w:t>
+            </w:r>
+            <w:r>
+              <w:rPr>
+                <w:rFonts w:ascii="微软雅黑" w:eastAsia="微软雅黑" w:hAnsi="微软雅黑" w:cs="Arial"/>
+                <w:bCs/>
+                <w:color w:val="000000"/>
+                <w:kern w:val="0"/>
+                <w:sz w:val="18"/>
+                <w:szCs w:val="18"/>
+              </w:rPr>
+              <w:t>{</w:t>
+            </w:r>
+            <w:proofErr w:type="spellStart"/>
+            <w:r>
+              <w:rPr>
+                <w:rFonts w:ascii="微软雅黑" w:eastAsia="微软雅黑" w:hAnsi="微软雅黑" w:cs="Arial"/>
+                <w:bCs/>
+                <w:color w:val="000000"/>
+                <w:kern w:val="0"/>
+                <w:sz w:val="18"/>
+                <w:szCs w:val="18"/>
+              </w:rPr>
+              <w:t>nSygrkk</w:t>
+            </w:r>
+            <w:proofErr w:type="spellEnd"/>
+            <w:r>
+              <w:rPr>
+                <w:rFonts w:ascii="微软雅黑" w:eastAsia="微软雅黑" w:hAnsi="微软雅黑" w:cs="Arial"/>
+                <w:bCs/>
+                <w:color w:val="000000"/>
+                <w:kern w:val="0"/>
+                <w:sz w:val="18"/>
+                <w:szCs w:val="18"/>
+              </w:rPr>
+              <w:t>}</w:t>
             </w:r>
           </w:p>
         </w:tc>
@@ -2349,6 +2630,35 @@
           <w:p>
             <w:pPr>
               <w:widowControl/>
+              <w:jc w:val="left"/>
+              <w:rPr>
+                <w:rFonts w:ascii="微软雅黑" w:eastAsia="微软雅黑" w:hAnsi="微软雅黑" w:cs="Arial"/>
+                <w:color w:val="000000"/>
+                <w:kern w:val="0"/>
+                <w:sz w:val="18"/>
+                <w:szCs w:val="18"/>
+              </w:rPr>
+            </w:pPr>
+            <w:r>
+              <w:rPr>
+                <w:rFonts w:ascii="微软雅黑" w:eastAsia="微软雅黑" w:hAnsi="微软雅黑" w:cs="Arial"/>
+                <w:color w:val="000000"/>
+                <w:kern w:val="0"/>
+                <w:sz w:val="18"/>
+                <w:szCs w:val="18"/>
+              </w:rPr>
+              <w:t>其他扣款</w:t>
+            </w:r>
+          </w:p>
+        </w:tc>
+        <w:tc>
+          <w:tcPr>
+            <w:tcW w:w="2569" w:type="dxa"/>
+            <w:vAlign w:val="center"/>
+          </w:tcPr>
+          <w:p>
+            <w:pPr>
+              <w:widowControl/>
               <w:jc w:val="center"/>
               <w:rPr>
                 <w:rFonts w:ascii="微软雅黑" w:eastAsia="微软雅黑" w:hAnsi="微软雅黑" w:cs="Arial"/>
@@ -2377,39 +2687,8 @@
                 <w:sz w:val="18"/>
                 <w:szCs w:val="18"/>
               </w:rPr>
-              <w:t>nJrf</w:t>
-            </w:r>
-            <w:proofErr w:type="spellEnd"/>
-            <w:r>
-              <w:rPr>
-                <w:rFonts w:ascii="微软雅黑" w:eastAsia="微软雅黑" w:hAnsi="微软雅黑" w:cs="Arial"/>
-                <w:color w:val="000000"/>
-                <w:kern w:val="0"/>
-                <w:sz w:val="18"/>
-                <w:szCs w:val="18"/>
-              </w:rPr>
-              <w:t>}</w:t>
-            </w:r>
-          </w:p>
-        </w:tc>
-        <w:tc>
-          <w:tcPr>
-            <w:tcW w:w="2460" w:type="dxa"/>
-            <w:vAlign w:val="center"/>
-          </w:tcPr>
-          <w:p>
-            <w:pPr>
-              <w:widowControl/>
-              <w:jc w:val="left"/>
-              <w:rPr>
-                <w:rFonts w:ascii="微软雅黑" w:eastAsia="微软雅黑" w:hAnsi="微软雅黑" w:cs="Arial"/>
-                <w:color w:val="000000"/>
-                <w:kern w:val="0"/>
-                <w:sz w:val="18"/>
-                <w:szCs w:val="18"/>
-              </w:rPr>
-            </w:pPr>
-            <w:proofErr w:type="gramStart"/>
+              <w:t>nQtkk_</w:t>
+            </w:r>
             <w:r>
               <w:rPr>
                 <w:rFonts w:ascii="微软雅黑" w:eastAsia="微软雅黑" w:hAnsi="微软雅黑" w:cs="Arial" w:hint="eastAsia"/>
@@ -2418,48 +2697,17 @@
                 <w:sz w:val="18"/>
                 <w:szCs w:val="18"/>
               </w:rPr>
-              <w:t>物业费</w:t>
-            </w:r>
-            <w:proofErr w:type="gramEnd"/>
-          </w:p>
-        </w:tc>
-        <w:tc>
-          <w:tcPr>
-            <w:tcW w:w="2569" w:type="dxa"/>
-            <w:vAlign w:val="center"/>
-          </w:tcPr>
-          <w:p>
-            <w:pPr>
-              <w:widowControl/>
-              <w:jc w:val="center"/>
-              <w:rPr>
-                <w:rFonts w:ascii="微软雅黑" w:eastAsia="微软雅黑" w:hAnsi="微软雅黑" w:cs="Arial"/>
-                <w:color w:val="000000"/>
-                <w:kern w:val="0"/>
-                <w:sz w:val="18"/>
-                <w:szCs w:val="18"/>
-              </w:rPr>
-            </w:pPr>
-            <w:r>
-              <w:rPr>
-                <w:rFonts w:ascii="微软雅黑" w:eastAsia="微软雅黑" w:hAnsi="微软雅黑" w:cs="Arial"/>
-                <w:color w:val="000000"/>
-                <w:kern w:val="0"/>
-                <w:sz w:val="18"/>
-                <w:szCs w:val="18"/>
-              </w:rPr>
-              <w:t>${</w:t>
-            </w:r>
-            <w:proofErr w:type="spellStart"/>
-            <w:r>
-              <w:rPr>
-                <w:rFonts w:ascii="微软雅黑" w:eastAsia="微软雅黑" w:hAnsi="微软雅黑" w:cs="Arial"/>
-                <w:color w:val="000000"/>
-                <w:kern w:val="0"/>
-                <w:sz w:val="18"/>
-                <w:szCs w:val="18"/>
-              </w:rPr>
-              <w:t>nWyf</w:t>
+              <w:t>m</w:t>
+            </w:r>
+            <w:r>
+              <w:rPr>
+                <w:rFonts w:ascii="微软雅黑" w:eastAsia="微软雅黑" w:hAnsi="微软雅黑" w:cs="Arial"/>
+                <w:color w:val="000000"/>
+                <w:kern w:val="0"/>
+                <w:sz w:val="18"/>
+                <w:szCs w:val="18"/>
+              </w:rPr>
+              <w:t>s</w:t>
             </w:r>
             <w:proofErr w:type="spellEnd"/>
             <w:r>
@@ -2504,7 +2752,7 @@
                 <w:sz w:val="18"/>
                 <w:szCs w:val="18"/>
               </w:rPr>
-              <w:t>养老个人扣款</w:t>
+              <w:t>医疗个人扣款</w:t>
             </w:r>
           </w:p>
         </w:tc>
@@ -2558,7 +2806,7 @@
                 <w:sz w:val="18"/>
                 <w:szCs w:val="18"/>
               </w:rPr>
-              <w:t>nEndowment</w:t>
+              <w:t>nMedical</w:t>
             </w:r>
             <w:proofErr w:type="spellEnd"/>
             <w:r>
@@ -2591,16 +2839,6 @@
                 <w:szCs w:val="18"/>
               </w:rPr>
             </w:pPr>
-            <w:r>
-              <w:rPr>
-                <w:rFonts w:ascii="微软雅黑" w:eastAsia="微软雅黑" w:hAnsi="微软雅黑" w:cs="Arial" w:hint="eastAsia"/>
-                <w:color w:val="000000"/>
-                <w:kern w:val="0"/>
-                <w:sz w:val="18"/>
-                <w:szCs w:val="18"/>
-              </w:rPr>
-              <w:t>电费</w:t>
-            </w:r>
           </w:p>
         </w:tc>
         <w:tc>
@@ -2620,240 +2858,6 @@
                 <w:szCs w:val="18"/>
               </w:rPr>
             </w:pPr>
-            <w:r>
-              <w:rPr>
-                <w:rFonts w:ascii="微软雅黑" w:eastAsia="微软雅黑" w:hAnsi="微软雅黑" w:cs="Arial"/>
-                <w:color w:val="000000"/>
-                <w:kern w:val="0"/>
-                <w:sz w:val="18"/>
-                <w:szCs w:val="18"/>
-              </w:rPr>
-              <w:t>${</w:t>
-            </w:r>
-            <w:proofErr w:type="spellStart"/>
-            <w:r>
-              <w:rPr>
-                <w:rFonts w:ascii="微软雅黑" w:eastAsia="微软雅黑" w:hAnsi="微软雅黑" w:cs="Arial"/>
-                <w:color w:val="000000"/>
-                <w:kern w:val="0"/>
-                <w:sz w:val="18"/>
-                <w:szCs w:val="18"/>
-              </w:rPr>
-              <w:t>nDf</w:t>
-            </w:r>
-            <w:proofErr w:type="spellEnd"/>
-            <w:r>
-              <w:rPr>
-                <w:rFonts w:ascii="微软雅黑" w:eastAsia="微软雅黑" w:hAnsi="微软雅黑" w:cs="Arial"/>
-                <w:color w:val="000000"/>
-                <w:kern w:val="0"/>
-                <w:sz w:val="18"/>
-                <w:szCs w:val="18"/>
-              </w:rPr>
-              <w:t>}</w:t>
-            </w:r>
-          </w:p>
-        </w:tc>
-        <w:bookmarkStart w:id="0" w:name="_GoBack"/>
-        <w:bookmarkEnd w:id="0"/>
-      </w:tr>
-      <w:tr>
-        <w:trPr>
-          <w:trHeight w:val="312"/>
-        </w:trPr>
-        <w:tc>
-          <w:tcPr>
-            <w:tcW w:w="2577" w:type="dxa"/>
-            <w:vAlign w:val="center"/>
-          </w:tcPr>
-          <w:p>
-            <w:pPr>
-              <w:widowControl/>
-              <w:jc w:val="left"/>
-              <w:rPr>
-                <w:rFonts w:ascii="微软雅黑" w:eastAsia="微软雅黑" w:hAnsi="微软雅黑" w:cs="Arial"/>
-                <w:color w:val="000000"/>
-                <w:kern w:val="0"/>
-                <w:sz w:val="18"/>
-                <w:szCs w:val="18"/>
-              </w:rPr>
-            </w:pPr>
-            <w:r>
-              <w:rPr>
-                <w:rFonts w:ascii="微软雅黑" w:eastAsia="微软雅黑" w:hAnsi="微软雅黑" w:cs="Arial"/>
-                <w:color w:val="000000"/>
-                <w:kern w:val="0"/>
-                <w:sz w:val="18"/>
-                <w:szCs w:val="18"/>
-              </w:rPr>
-              <w:t>失业个人扣款</w:t>
-            </w:r>
-          </w:p>
-        </w:tc>
-        <w:tc>
-          <w:tcPr>
-            <w:tcW w:w="2460" w:type="dxa"/>
-            <w:vAlign w:val="center"/>
-          </w:tcPr>
-          <w:p>
-            <w:pPr>
-              <w:widowControl/>
-              <w:jc w:val="center"/>
-              <w:rPr>
-                <w:rFonts w:ascii="微软雅黑" w:eastAsia="微软雅黑" w:hAnsi="微软雅黑" w:cs="Arial"/>
-                <w:bCs/>
-                <w:color w:val="000000"/>
-                <w:kern w:val="0"/>
-                <w:sz w:val="18"/>
-                <w:szCs w:val="18"/>
-              </w:rPr>
-            </w:pPr>
-            <w:r>
-              <w:rPr>
-                <w:rFonts w:ascii="微软雅黑" w:eastAsia="微软雅黑" w:hAnsi="微软雅黑" w:cs="Arial" w:hint="eastAsia"/>
-                <w:bCs/>
-                <w:color w:val="000000"/>
-                <w:kern w:val="0"/>
-                <w:sz w:val="18"/>
-                <w:szCs w:val="18"/>
-              </w:rPr>
-              <w:t>$</w:t>
-            </w:r>
-            <w:r>
-              <w:rPr>
-                <w:rFonts w:ascii="微软雅黑" w:eastAsia="微软雅黑" w:hAnsi="微软雅黑" w:cs="Arial"/>
-                <w:bCs/>
-                <w:color w:val="000000"/>
-                <w:kern w:val="0"/>
-                <w:sz w:val="18"/>
-                <w:szCs w:val="18"/>
-              </w:rPr>
-              <w:t>{</w:t>
-            </w:r>
-            <w:proofErr w:type="spellStart"/>
-            <w:r>
-              <w:rPr>
-                <w:rFonts w:ascii="微软雅黑" w:eastAsia="微软雅黑" w:hAnsi="微软雅黑" w:cs="Arial"/>
-                <w:bCs/>
-                <w:color w:val="000000"/>
-                <w:kern w:val="0"/>
-                <w:sz w:val="18"/>
-                <w:szCs w:val="18"/>
-              </w:rPr>
-              <w:t>nSygrkk</w:t>
-            </w:r>
-            <w:proofErr w:type="spellEnd"/>
-            <w:r>
-              <w:rPr>
-                <w:rFonts w:ascii="微软雅黑" w:eastAsia="微软雅黑" w:hAnsi="微软雅黑" w:cs="Arial"/>
-                <w:bCs/>
-                <w:color w:val="000000"/>
-                <w:kern w:val="0"/>
-                <w:sz w:val="18"/>
-                <w:szCs w:val="18"/>
-              </w:rPr>
-              <w:t>}</w:t>
-            </w:r>
-          </w:p>
-        </w:tc>
-        <w:tc>
-          <w:tcPr>
-            <w:tcW w:w="2460" w:type="dxa"/>
-            <w:vAlign w:val="center"/>
-          </w:tcPr>
-          <w:p>
-            <w:pPr>
-              <w:widowControl/>
-              <w:jc w:val="left"/>
-              <w:rPr>
-                <w:rFonts w:ascii="微软雅黑" w:eastAsia="微软雅黑" w:hAnsi="微软雅黑" w:cs="Arial"/>
-                <w:color w:val="000000"/>
-                <w:kern w:val="0"/>
-                <w:sz w:val="18"/>
-                <w:szCs w:val="18"/>
-              </w:rPr>
-            </w:pPr>
-            <w:r>
-              <w:rPr>
-                <w:rFonts w:ascii="微软雅黑" w:eastAsia="微软雅黑" w:hAnsi="微软雅黑" w:cs="Arial"/>
-                <w:color w:val="000000"/>
-                <w:kern w:val="0"/>
-                <w:sz w:val="18"/>
-                <w:szCs w:val="18"/>
-              </w:rPr>
-              <w:t>其他扣款</w:t>
-            </w:r>
-          </w:p>
-        </w:tc>
-        <w:tc>
-          <w:tcPr>
-            <w:tcW w:w="2569" w:type="dxa"/>
-            <w:vAlign w:val="center"/>
-          </w:tcPr>
-          <w:p>
-            <w:pPr>
-              <w:widowControl/>
-              <w:jc w:val="center"/>
-              <w:rPr>
-                <w:rFonts w:ascii="微软雅黑" w:eastAsia="微软雅黑" w:hAnsi="微软雅黑" w:cs="Arial"/>
-                <w:color w:val="000000"/>
-                <w:kern w:val="0"/>
-                <w:sz w:val="18"/>
-                <w:szCs w:val="18"/>
-              </w:rPr>
-            </w:pPr>
-            <w:r>
-              <w:rPr>
-                <w:rFonts w:ascii="微软雅黑" w:eastAsia="微软雅黑" w:hAnsi="微软雅黑" w:cs="Arial"/>
-                <w:color w:val="000000"/>
-                <w:kern w:val="0"/>
-                <w:sz w:val="18"/>
-                <w:szCs w:val="18"/>
-              </w:rPr>
-              <w:t>${</w:t>
-            </w:r>
-            <w:proofErr w:type="spellStart"/>
-            <w:r>
-              <w:rPr>
-                <w:rFonts w:ascii="微软雅黑" w:eastAsia="微软雅黑" w:hAnsi="微软雅黑" w:cs="Arial"/>
-                <w:color w:val="000000"/>
-                <w:kern w:val="0"/>
-                <w:sz w:val="18"/>
-                <w:szCs w:val="18"/>
-              </w:rPr>
-              <w:t>nQtkk_</w:t>
-            </w:r>
-            <w:r>
-              <w:rPr>
-                <w:rFonts w:ascii="微软雅黑" w:eastAsia="微软雅黑" w:hAnsi="微软雅黑" w:cs="Arial" w:hint="eastAsia"/>
-                <w:color w:val="000000"/>
-                <w:kern w:val="0"/>
-                <w:sz w:val="18"/>
-                <w:szCs w:val="18"/>
-              </w:rPr>
-              <w:t>m</w:t>
-            </w:r>
-            <w:r>
-              <w:rPr>
-                <w:rFonts w:ascii="微软雅黑" w:eastAsia="微软雅黑" w:hAnsi="微软雅黑" w:cs="Arial"/>
-                <w:color w:val="000000"/>
-                <w:kern w:val="0"/>
-                <w:sz w:val="18"/>
-                <w:szCs w:val="18"/>
-              </w:rPr>
-              <w:t>s</w:t>
-            </w:r>
-            <w:proofErr w:type="spellEnd"/>
-            <w:r>
-              <w:rPr>
-                <w:rFonts w:ascii="微软雅黑" w:eastAsia="微软雅黑" w:hAnsi="微软雅黑" w:cs="Arial"/>
-                <w:color w:val="000000"/>
-                <w:kern w:val="0"/>
-                <w:sz w:val="18"/>
-                <w:szCs w:val="18"/>
-              </w:rPr>
-              <w:t>}</w:t>
-            </w:r>
           </w:p>
         </w:tc>
       </w:tr>
@@ -2956,15 +2960,7 @@
                 <w:sz w:val="18"/>
                 <w:szCs w:val="19"/>
               </w:rPr>
-              <w:t>奖励</w:t>
-            </w:r>
-            <w:r>
-              <w:rPr>
-                <w:rFonts w:ascii="微软雅黑" w:eastAsia="微软雅黑" w:hAnsi="微软雅黑" w:cs="Arial" w:hint="eastAsia"/>
-                <w:sz w:val="18"/>
-                <w:szCs w:val="19"/>
-              </w:rPr>
-              <w:t>(加薪</w:t>
+              <w:t>奖励(加薪</w:t>
             </w:r>
             <w:r>
               <w:rPr>
@@ -3431,23 +3427,39 @@
           <w:sz w:val="18"/>
         </w:rPr>
       </w:pPr>
-      <w:proofErr w:type="gramStart"/>
       <w:r>
         <w:rPr>
           <w:rFonts w:ascii="微软雅黑" w:eastAsia="微软雅黑" w:hAnsi="微软雅黑" w:cs="Arial" w:hint="eastAsia"/>
           <w:b/>
           <w:sz w:val="18"/>
         </w:rPr>
-        <w:t>湘邮科技</w:t>
-      </w:r>
-      <w:proofErr w:type="gramEnd"/>
-      <w:r>
-        <w:rPr>
-          <w:rFonts w:ascii="微软雅黑" w:eastAsia="微软雅黑" w:hAnsi="微软雅黑" w:cs="Arial" w:hint="eastAsia"/>
+        <w:t>$</w:t>
+      </w:r>
+      <w:r>
+        <w:rPr>
+          <w:rFonts w:ascii="微软雅黑" w:eastAsia="微软雅黑" w:hAnsi="微软雅黑" w:cs="Arial"/>
           <w:b/>
           <w:sz w:val="18"/>
         </w:rPr>
-        <w:t>软件开发部</w:t>
+        <w:t>{</w:t>
+      </w:r>
+      <w:proofErr w:type="spellStart"/>
+      <w:r>
+        <w:rPr>
+          <w:rFonts w:ascii="微软雅黑" w:eastAsia="微软雅黑" w:hAnsi="微软雅黑" w:cs="Arial"/>
+          <w:b/>
+          <w:sz w:val="18"/>
+        </w:rPr>
+        <w:t>cDeptName</w:t>
+      </w:r>
+      <w:proofErr w:type="spellEnd"/>
+      <w:r>
+        <w:rPr>
+          <w:rFonts w:ascii="微软雅黑" w:eastAsia="微软雅黑" w:hAnsi="微软雅黑" w:cs="Arial"/>
+          <w:b/>
+          <w:sz w:val="18"/>
+        </w:rPr>
+        <w:t>}</w:t>
       </w:r>
     </w:p>
     <w:p>
@@ -4588,6 +4600,18 @@
       <w:shd w:val="clear" w:color="auto" w:fill="E1DFDD"/>
     </w:rPr>
   </w:style>
+  <w:style w:type="character" w:styleId="af0">
+    <w:name w:val="Unresolved Mention"/>
+    <w:basedOn w:val="a0"/>
+    <w:uiPriority w:val="99"/>
+    <w:semiHidden/>
+    <w:unhideWhenUsed/>
+    <w:rsid w:val="00FE72EF"/>
+    <w:rPr>
+      <w:color w:val="605E5C"/>
+      <w:shd w:val="clear" w:color="auto" w:fill="E1DFDD"/>
+    </w:rPr>
+  </w:style>
 </w:styles>
 </file>
 
@@ -4874,7 +4898,7 @@
 </file>
 
 <file path=customXml/itemProps2.xml><?xml version="1.0" encoding="utf-8"?>
-<ds:datastoreItem xmlns:ds="http://schemas.openxmlformats.org/officeDocument/2006/customXml" ds:itemID="{63C63E97-014B-4C2B-86D2-B5FB30CA8DB6}">
+<ds:datastoreItem xmlns:ds="http://schemas.openxmlformats.org/officeDocument/2006/customXml" ds:itemID="{CC389CB2-C25B-4448-B997-8F3A950A2DCB}">
   <ds:schemaRefs>
     <ds:schemaRef ds:uri="http://schemas.openxmlformats.org/officeDocument/2006/bibliography"/>
   </ds:schemaRefs>

</xml_diff>